<commit_message>
Updates in cv and publication list
Updates in cv and publication list
</commit_message>
<xml_diff>
--- a/Publication list_ReussiteMalembaka.docx
+++ b/Publication list_ReussiteMalembaka.docx
@@ -17,15 +17,43 @@
           <w:b/>
           <w:bCs/>
         </w:rPr>
-        <w:t>List</w:t>
-      </w:r>
-      <w:r>
-        <w:rPr>
-          <w:rFonts w:ascii="Times New Roman" w:hAnsi="Times New Roman" w:cs="Times New Roman"/>
-          <w:b/>
-          <w:bCs/>
-        </w:rPr>
-        <w:t xml:space="preserve"> of Reussite Malembaka’s publication</w:t>
+        <w:t xml:space="preserve">List of </w:t>
+      </w:r>
+      <w:proofErr w:type="spellStart"/>
+      <w:r>
+        <w:rPr>
+          <w:rFonts w:ascii="Times New Roman" w:hAnsi="Times New Roman" w:cs="Times New Roman"/>
+          <w:b/>
+          <w:bCs/>
+        </w:rPr>
+        <w:t>Reussite</w:t>
+      </w:r>
+      <w:proofErr w:type="spellEnd"/>
+      <w:r>
+        <w:rPr>
+          <w:rFonts w:ascii="Times New Roman" w:hAnsi="Times New Roman" w:cs="Times New Roman"/>
+          <w:b/>
+          <w:bCs/>
+        </w:rPr>
+        <w:t xml:space="preserve"> </w:t>
+      </w:r>
+      <w:proofErr w:type="spellStart"/>
+      <w:r>
+        <w:rPr>
+          <w:rFonts w:ascii="Times New Roman" w:hAnsi="Times New Roman" w:cs="Times New Roman"/>
+          <w:b/>
+          <w:bCs/>
+        </w:rPr>
+        <w:t>Malembaka’s</w:t>
+      </w:r>
+      <w:proofErr w:type="spellEnd"/>
+      <w:r>
+        <w:rPr>
+          <w:rFonts w:ascii="Times New Roman" w:hAnsi="Times New Roman" w:cs="Times New Roman"/>
+          <w:b/>
+          <w:bCs/>
+        </w:rPr>
+        <w:t xml:space="preserve"> publication</w:t>
       </w:r>
     </w:p>
     <w:p>
@@ -40,7 +68,7 @@
         </w:rPr>
         <w:t xml:space="preserve">All my published papers are highlighted on my website: </w:t>
       </w:r>
-      <w:hyperlink r:id="rId4" w:history="1">
+      <w:hyperlink r:id="rId5" w:history="1">
         <w:r>
           <w:rPr>
             <w:rStyle w:val="Hyperlink"/>
@@ -75,6 +103,8 @@
       <w:pPr>
         <w:rPr>
           <w:rFonts w:ascii="Times New Roman" w:hAnsi="Times New Roman" w:cs="Times New Roman"/>
+          <w:b/>
+          <w:bCs/>
         </w:rPr>
       </w:pPr>
       <w:r>
@@ -82,14 +112,78 @@
           <w:rFonts w:ascii="Times New Roman" w:hAnsi="Times New Roman" w:cs="Times New Roman"/>
           <w:b/>
           <w:bCs/>
+          <w:lang/>
         </w:rPr>
         <w:t>Malembaka, R.B.</w:t>
       </w:r>
       <w:r>
         <w:rPr>
           <w:rFonts w:ascii="Times New Roman" w:hAnsi="Times New Roman" w:cs="Times New Roman"/>
-        </w:rPr>
-        <w:t> , Pfister, S., Thom, B., Kintche, K., Jacobi, J., 2025:</w:t>
+          <w:bCs/>
+          <w:lang/>
+        </w:rPr>
+        <w:t xml:space="preserve">, Pfister, S., Thom, B., Cintrão, R.P., Trivilin, M.I. and Jacobi, J., 2025. Are alternatively organized value chains more environmentally sustainable? Evidence from soybean production in Minas Gerais and Paraná states, Brazil. Frontiers in Sustainable Food Systems, 9, p.1681792. </w:t>
+      </w:r>
+      <w:hyperlink r:id="rId6" w:history="1">
+        <w:r>
+          <w:rPr>
+            <w:rStyle w:val="Hyperlink"/>
+            <w:rFonts w:ascii="Times New Roman" w:hAnsi="Times New Roman" w:cs="Times New Roman"/>
+            <w:bCs/>
+            <w:lang/>
+          </w:rPr>
+          <w:t>https://doi.org/10.3389/fsufs.2025.1681792</w:t>
+        </w:r>
+      </w:hyperlink>
+      <w:r>
+        <w:rPr>
+          <w:rFonts w:ascii="Times New Roman" w:hAnsi="Times New Roman" w:cs="Times New Roman"/>
+          <w:bCs/>
+        </w:rPr>
+        <w:t xml:space="preserve"> </w:t>
+      </w:r>
+      <w:r>
+        <w:rPr>
+          <w:rFonts w:ascii="Times New Roman" w:hAnsi="Times New Roman" w:cs="Times New Roman"/>
+          <w:bCs/>
+          <w:lang/>
+        </w:rPr>
+        <w:t xml:space="preserve"> </w:t>
+      </w:r>
+    </w:p>
+    <w:p>
+      <w:pPr>
+        <w:rPr>
+          <w:rFonts w:ascii="Times New Roman" w:hAnsi="Times New Roman" w:cs="Times New Roman"/>
+        </w:rPr>
+      </w:pPr>
+      <w:r>
+        <w:rPr>
+          <w:rFonts w:ascii="Times New Roman" w:hAnsi="Times New Roman" w:cs="Times New Roman"/>
+          <w:b/>
+          <w:bCs/>
+        </w:rPr>
+        <w:t>Malembaka, R.B.</w:t>
+      </w:r>
+      <w:r>
+        <w:rPr>
+          <w:rFonts w:ascii="Times New Roman" w:hAnsi="Times New Roman" w:cs="Times New Roman"/>
+        </w:rPr>
+        <w:t xml:space="preserve"> , Pfister, S., Thom, B., </w:t>
+      </w:r>
+      <w:proofErr w:type="spellStart"/>
+      <w:r>
+        <w:rPr>
+          <w:rFonts w:ascii="Times New Roman" w:hAnsi="Times New Roman" w:cs="Times New Roman"/>
+        </w:rPr>
+        <w:t>Kintche</w:t>
+      </w:r>
+      <w:proofErr w:type="spellEnd"/>
+      <w:r>
+        <w:rPr>
+          <w:rFonts w:ascii="Times New Roman" w:hAnsi="Times New Roman" w:cs="Times New Roman"/>
+        </w:rPr>
+        <w:t>, K., Jacobi, J., 2025:</w:t>
       </w:r>
       <w:r>
         <w:rPr>
@@ -97,303 +191,328 @@
         </w:rPr>
         <w:br/>
       </w:r>
-      <w:hyperlink r:id="rId5" w:history="1">
+      <w:hyperlink r:id="rId7" w:history="1">
         <w:r>
           <w:rPr>
             <w:rStyle w:val="Hyperlink"/>
             <w:rFonts w:ascii="Times New Roman" w:hAnsi="Times New Roman" w:cs="Times New Roman"/>
           </w:rPr>
-          <w:t>Ecological sustainability and role of Farmers’</w:t>
+          <w:t>Ecological sustainability and role of Farmers’ Organisations in soybean production systems in DR Congo, </w:t>
         </w:r>
+      </w:hyperlink>
+      <w:r>
+        <w:rPr>
+          <w:rFonts w:ascii="Times New Roman" w:hAnsi="Times New Roman" w:cs="Times New Roman"/>
+          <w:b/>
+          <w:bCs/>
+        </w:rPr>
+        <w:t>preprint</w:t>
+      </w:r>
+      <w:r>
+        <w:rPr>
+          <w:rFonts w:ascii="Times New Roman" w:hAnsi="Times New Roman" w:cs="Times New Roman"/>
+        </w:rPr>
+        <w:t> </w:t>
+      </w:r>
+      <w:proofErr w:type="spellStart"/>
+      <w:r>
+        <w:rPr>
+          <w:rFonts w:ascii="Times New Roman" w:hAnsi="Times New Roman" w:cs="Times New Roman"/>
+        </w:rPr>
+        <w:t>doi</w:t>
+      </w:r>
+      <w:proofErr w:type="spellEnd"/>
+      <w:r>
+        <w:rPr>
+          <w:rFonts w:ascii="Times New Roman" w:hAnsi="Times New Roman" w:cs="Times New Roman"/>
+        </w:rPr>
+        <w:t>: 10.2139/ssrn.5165929</w:t>
+      </w:r>
+      <w:r>
+        <w:rPr>
+          <w:rFonts w:ascii="Times New Roman" w:hAnsi="Times New Roman" w:cs="Times New Roman"/>
+        </w:rPr>
+        <w:t xml:space="preserve"> (Submitted to Elsevier Journal: Environmental Impact Assessment Review</w:t>
+      </w:r>
+      <w:r>
+        <w:rPr>
+          <w:rFonts w:ascii="Times New Roman" w:hAnsi="Times New Roman" w:cs="Times New Roman"/>
+        </w:rPr>
+        <w:t xml:space="preserve"> (</w:t>
+      </w:r>
+      <w:r>
+        <w:rPr>
+          <w:rFonts w:ascii="Times New Roman" w:hAnsi="Times New Roman" w:cs="Times New Roman"/>
+        </w:rPr>
+        <w:t>in 2</w:t>
+      </w:r>
+      <w:r>
+        <w:rPr>
+          <w:rFonts w:ascii="Times New Roman" w:hAnsi="Times New Roman" w:cs="Times New Roman"/>
+          <w:vertAlign w:val="superscript"/>
+        </w:rPr>
+        <w:t>nd</w:t>
+      </w:r>
+      <w:r>
+        <w:rPr>
+          <w:rFonts w:ascii="Times New Roman" w:hAnsi="Times New Roman" w:cs="Times New Roman"/>
+        </w:rPr>
+        <w:t xml:space="preserve"> revision process).</w:t>
+      </w:r>
+    </w:p>
+    <w:p>
+      <w:pPr>
+        <w:rPr>
+          <w:rFonts w:ascii="Times New Roman" w:hAnsi="Times New Roman" w:cs="Times New Roman"/>
+        </w:rPr>
+      </w:pPr>
+      <w:r>
+        <w:rPr>
+          <w:rFonts w:ascii="Times New Roman" w:hAnsi="Times New Roman" w:cs="Times New Roman"/>
+          <w:b/>
+          <w:bCs/>
+        </w:rPr>
+        <w:t xml:space="preserve">Réussite </w:t>
+      </w:r>
+      <w:proofErr w:type="spellStart"/>
+      <w:r>
+        <w:rPr>
+          <w:rFonts w:ascii="Times New Roman" w:hAnsi="Times New Roman" w:cs="Times New Roman"/>
+          <w:b/>
+          <w:bCs/>
+        </w:rPr>
+        <w:t>Bugale</w:t>
+      </w:r>
+      <w:proofErr w:type="spellEnd"/>
+      <w:r>
+        <w:rPr>
+          <w:rFonts w:ascii="Times New Roman" w:hAnsi="Times New Roman" w:cs="Times New Roman"/>
+          <w:b/>
+          <w:bCs/>
+        </w:rPr>
+        <w:t xml:space="preserve"> Malembaka*</w:t>
+      </w:r>
+      <w:r>
+        <w:rPr>
+          <w:rFonts w:ascii="Times New Roman" w:hAnsi="Times New Roman" w:cs="Times New Roman"/>
+        </w:rPr>
+        <w:t xml:space="preserve">, Stephan Pfister, Bianca Torres, Johanna Jacobi. 2025. </w:t>
+      </w:r>
+      <w:r>
+        <w:rPr>
+          <w:rFonts w:ascii="Times New Roman" w:hAnsi="Times New Roman" w:cs="Times New Roman"/>
+          <w:b/>
+          <w:bCs/>
+        </w:rPr>
+        <w:t>Environmental sustainability of soybean - chicken productions: local and global value chains analysis from Paraná and São Paulo states, Brazil</w:t>
+      </w:r>
+      <w:r>
+        <w:rPr>
+          <w:rFonts w:ascii="Times New Roman" w:hAnsi="Times New Roman" w:cs="Times New Roman"/>
+        </w:rPr>
+        <w:t xml:space="preserve">. </w:t>
+      </w:r>
+      <w:r>
+        <w:rPr>
+          <w:rFonts w:ascii="Times New Roman" w:hAnsi="Times New Roman" w:cs="Times New Roman"/>
+        </w:rPr>
+        <w:t>Submitted</w:t>
+      </w:r>
+      <w:r>
+        <w:rPr>
+          <w:rFonts w:ascii="Times New Roman" w:hAnsi="Times New Roman" w:cs="Times New Roman"/>
+        </w:rPr>
+        <w:t xml:space="preserve"> in Environ. Res.: Food Syst. Manuscript number: ERFS-100194.</w:t>
+      </w:r>
+    </w:p>
+    <w:p>
+      <w:pPr>
+        <w:rPr>
+          <w:rFonts w:ascii="Times New Roman" w:hAnsi="Times New Roman" w:cs="Times New Roman"/>
+        </w:rPr>
+      </w:pPr>
+      <w:r>
+        <w:rPr>
+          <w:rFonts w:ascii="Times New Roman" w:hAnsi="Times New Roman" w:cs="Times New Roman"/>
+          <w:b/>
+          <w:bCs/>
+        </w:rPr>
+        <w:t>2024</w:t>
+      </w:r>
+    </w:p>
+    <w:p>
+      <w:pPr>
+        <w:rPr>
+          <w:rFonts w:ascii="Times New Roman" w:hAnsi="Times New Roman" w:cs="Times New Roman"/>
+        </w:rPr>
+      </w:pPr>
+      <w:proofErr w:type="spellStart"/>
+      <w:r>
+        <w:rPr>
+          <w:rFonts w:ascii="Times New Roman" w:hAnsi="Times New Roman" w:cs="Times New Roman"/>
+        </w:rPr>
+        <w:t>Cintrão</w:t>
+      </w:r>
+      <w:proofErr w:type="spellEnd"/>
+      <w:r>
+        <w:rPr>
+          <w:rFonts w:ascii="Times New Roman" w:hAnsi="Times New Roman" w:cs="Times New Roman"/>
+        </w:rPr>
+        <w:t xml:space="preserve">, R.P., </w:t>
+      </w:r>
+      <w:proofErr w:type="spellStart"/>
+      <w:r>
+        <w:rPr>
+          <w:rFonts w:ascii="Times New Roman" w:hAnsi="Times New Roman" w:cs="Times New Roman"/>
+        </w:rPr>
+        <w:t>Trivilin</w:t>
+      </w:r>
+      <w:proofErr w:type="spellEnd"/>
+      <w:r>
+        <w:rPr>
+          <w:rFonts w:ascii="Times New Roman" w:hAnsi="Times New Roman" w:cs="Times New Roman"/>
+        </w:rPr>
+        <w:t>, M.I., Jacobi, J., </w:t>
+      </w:r>
+      <w:r>
+        <w:rPr>
+          <w:rFonts w:ascii="Times New Roman" w:hAnsi="Times New Roman" w:cs="Times New Roman"/>
+          <w:b/>
+          <w:bCs/>
+        </w:rPr>
+        <w:t>Malembaka, R.B.</w:t>
+      </w:r>
+      <w:r>
+        <w:rPr>
+          <w:rFonts w:ascii="Times New Roman" w:hAnsi="Times New Roman" w:cs="Times New Roman"/>
+        </w:rPr>
+        <w:t> and Sigrist, M., 2024:</w:t>
+      </w:r>
+      <w:r>
+        <w:rPr>
+          <w:rFonts w:ascii="Times New Roman" w:hAnsi="Times New Roman" w:cs="Times New Roman"/>
+        </w:rPr>
+        <w:br/>
+      </w:r>
+      <w:hyperlink r:id="rId8" w:history="1">
         <w:r>
           <w:rPr>
             <w:rStyle w:val="Hyperlink"/>
             <w:rFonts w:ascii="Times New Roman" w:hAnsi="Times New Roman" w:cs="Times New Roman"/>
           </w:rPr>
-          <w:t xml:space="preserve"> </w:t>
+          <w:t xml:space="preserve">O </w:t>
         </w:r>
+        <w:proofErr w:type="spellStart"/>
         <w:r>
           <w:rPr>
             <w:rStyle w:val="Hyperlink"/>
             <w:rFonts w:ascii="Times New Roman" w:hAnsi="Times New Roman" w:cs="Times New Roman"/>
           </w:rPr>
-          <w:t>Organisations in soybean production systems in DR Congo, </w:t>
+          <w:t>poder</w:t>
         </w:r>
-      </w:hyperlink>
-      <w:r>
-        <w:rPr>
-          <w:rFonts w:ascii="Times New Roman" w:hAnsi="Times New Roman" w:cs="Times New Roman"/>
-          <w:b/>
-          <w:bCs/>
-        </w:rPr>
-        <w:t>preprint</w:t>
-      </w:r>
-      <w:r>
-        <w:rPr>
-          <w:rFonts w:ascii="Times New Roman" w:hAnsi="Times New Roman" w:cs="Times New Roman"/>
-        </w:rPr>
-        <w:t> doi: 10.2139/ssrn.5165929</w:t>
-      </w:r>
-      <w:r>
-        <w:rPr>
-          <w:rFonts w:ascii="Times New Roman" w:hAnsi="Times New Roman" w:cs="Times New Roman"/>
-        </w:rPr>
-        <w:t xml:space="preserve"> (Submitted to Elsevier Journal: Environmental Impact Assessment Review</w:t>
-      </w:r>
-      <w:r>
-        <w:rPr>
-          <w:rFonts w:ascii="Times New Roman" w:hAnsi="Times New Roman" w:cs="Times New Roman"/>
-        </w:rPr>
-        <w:t xml:space="preserve"> (</w:t>
-      </w:r>
-      <w:r>
-        <w:rPr>
-          <w:rFonts w:ascii="Times New Roman" w:hAnsi="Times New Roman" w:cs="Times New Roman"/>
-        </w:rPr>
-        <w:t>in 2</w:t>
-      </w:r>
-      <w:r>
-        <w:rPr>
-          <w:rFonts w:ascii="Times New Roman" w:hAnsi="Times New Roman" w:cs="Times New Roman"/>
-          <w:vertAlign w:val="superscript"/>
-        </w:rPr>
-        <w:t>nd</w:t>
-      </w:r>
-      <w:r>
-        <w:rPr>
-          <w:rFonts w:ascii="Times New Roman" w:hAnsi="Times New Roman" w:cs="Times New Roman"/>
-        </w:rPr>
-        <w:t xml:space="preserve"> revision process).</w:t>
-      </w:r>
-    </w:p>
-    <w:p>
-      <w:pPr>
-        <w:rPr>
-          <w:rFonts w:ascii="Times New Roman" w:hAnsi="Times New Roman" w:cs="Times New Roman"/>
-        </w:rPr>
-      </w:pPr>
-      <w:r>
-        <w:rPr>
-          <w:rFonts w:ascii="Times New Roman" w:hAnsi="Times New Roman" w:cs="Times New Roman"/>
-          <w:b/>
-          <w:bCs/>
-        </w:rPr>
-        <w:t>Réussite Bugale Malembaka *</w:t>
-      </w:r>
-      <w:r>
-        <w:rPr>
-          <w:rFonts w:ascii="Times New Roman" w:hAnsi="Times New Roman" w:cs="Times New Roman"/>
-        </w:rPr>
-        <w:t xml:space="preserve"> , Stephan Pfister , Braida Thom , Rosângela Pezza Cintrão , Maria Isabel Trivilin and Johanna Jacobi. </w:t>
-      </w:r>
-      <w:r>
-        <w:rPr>
-          <w:rFonts w:ascii="Times New Roman" w:hAnsi="Times New Roman" w:cs="Times New Roman"/>
-        </w:rPr>
-        <w:t xml:space="preserve">2025. </w:t>
-      </w:r>
-      <w:r>
-        <w:rPr>
-          <w:rFonts w:ascii="Times New Roman" w:hAnsi="Times New Roman" w:cs="Times New Roman"/>
-          <w:b/>
-          <w:bCs/>
-        </w:rPr>
-        <w:t xml:space="preserve">Are alternatively organized </w:t>
-      </w:r>
-      <w:r>
-        <w:rPr>
-          <w:rFonts w:ascii="Times New Roman" w:hAnsi="Times New Roman" w:cs="Times New Roman"/>
-          <w:b/>
-          <w:bCs/>
-        </w:rPr>
-        <w:t>systems</w:t>
-      </w:r>
-      <w:r>
-        <w:rPr>
-          <w:rFonts w:ascii="Times New Roman" w:hAnsi="Times New Roman" w:cs="Times New Roman"/>
-          <w:b/>
-          <w:bCs/>
-        </w:rPr>
-        <w:t xml:space="preserve"> more environmentally sustainable? Evidence from soybean production in Minas Gerais and Paraná states, Brazil</w:t>
-      </w:r>
-      <w:r>
-        <w:rPr>
-          <w:rFonts w:ascii="Times New Roman" w:hAnsi="Times New Roman" w:cs="Times New Roman"/>
-        </w:rPr>
-        <w:t>.</w:t>
-      </w:r>
-      <w:r>
-        <w:rPr>
-          <w:rFonts w:ascii="Times New Roman" w:hAnsi="Times New Roman" w:cs="Times New Roman"/>
-        </w:rPr>
-        <w:t xml:space="preserve"> </w:t>
-      </w:r>
-      <w:r>
-        <w:rPr>
-          <w:rFonts w:ascii="Times New Roman" w:hAnsi="Times New Roman" w:cs="Times New Roman"/>
-        </w:rPr>
-        <w:t xml:space="preserve">Original </w:t>
-      </w:r>
-      <w:r>
-        <w:rPr>
-          <w:rFonts w:ascii="Times New Roman" w:hAnsi="Times New Roman" w:cs="Times New Roman"/>
-        </w:rPr>
-        <w:t>r</w:t>
-      </w:r>
-      <w:r>
-        <w:rPr>
-          <w:rFonts w:ascii="Times New Roman" w:hAnsi="Times New Roman" w:cs="Times New Roman"/>
-        </w:rPr>
-        <w:t>esearch submitted,</w:t>
-      </w:r>
-      <w:r>
-        <w:rPr>
-          <w:rFonts w:ascii="Times New Roman" w:hAnsi="Times New Roman" w:cs="Times New Roman"/>
-        </w:rPr>
-        <w:t xml:space="preserve"> </w:t>
-      </w:r>
-      <w:r>
-        <w:rPr>
-          <w:rFonts w:ascii="Times New Roman" w:hAnsi="Times New Roman" w:cs="Times New Roman"/>
-        </w:rPr>
-        <w:t>Front. Sustain. Food Syst. Manuscript ID: 1681792</w:t>
-      </w:r>
-      <w:r>
-        <w:rPr>
-          <w:rFonts w:ascii="Times New Roman" w:hAnsi="Times New Roman" w:cs="Times New Roman"/>
-        </w:rPr>
-        <w:t xml:space="preserve"> </w:t>
-      </w:r>
-      <w:r>
-        <w:rPr>
-          <w:rFonts w:ascii="Times New Roman" w:hAnsi="Times New Roman" w:cs="Times New Roman"/>
-        </w:rPr>
-        <w:t>(in 2</w:t>
-      </w:r>
-      <w:r>
-        <w:rPr>
-          <w:rFonts w:ascii="Times New Roman" w:hAnsi="Times New Roman" w:cs="Times New Roman"/>
-          <w:vertAlign w:val="superscript"/>
-        </w:rPr>
-        <w:t>nd</w:t>
-      </w:r>
-      <w:r>
-        <w:rPr>
-          <w:rFonts w:ascii="Times New Roman" w:hAnsi="Times New Roman" w:cs="Times New Roman"/>
-        </w:rPr>
-        <w:t xml:space="preserve"> revision process)</w:t>
-      </w:r>
-    </w:p>
-    <w:p>
-      <w:pPr>
-        <w:rPr>
-          <w:rFonts w:ascii="Times New Roman" w:hAnsi="Times New Roman" w:cs="Times New Roman"/>
-        </w:rPr>
-      </w:pPr>
-      <w:r>
-        <w:rPr>
-          <w:rFonts w:ascii="Times New Roman" w:hAnsi="Times New Roman" w:cs="Times New Roman"/>
-          <w:b/>
-          <w:bCs/>
-        </w:rPr>
-        <w:t>Réussite Bugale Malembaka*</w:t>
-      </w:r>
-      <w:r>
-        <w:rPr>
-          <w:rFonts w:ascii="Times New Roman" w:hAnsi="Times New Roman" w:cs="Times New Roman"/>
-        </w:rPr>
-        <w:t xml:space="preserve">, Stephan Pfister, Bianca Torres, Johanna Jacobi. 2025. </w:t>
-      </w:r>
-      <w:r>
-        <w:rPr>
-          <w:rFonts w:ascii="Times New Roman" w:hAnsi="Times New Roman" w:cs="Times New Roman"/>
-          <w:b/>
-          <w:bCs/>
-        </w:rPr>
-        <w:t>Environmental sustainability of soybean - chicken productions: local and global value chains analysis from Paraná and São Paulo states, Brazil</w:t>
-      </w:r>
-      <w:r>
-        <w:rPr>
-          <w:rFonts w:ascii="Times New Roman" w:hAnsi="Times New Roman" w:cs="Times New Roman"/>
-        </w:rPr>
-        <w:t xml:space="preserve">. </w:t>
-      </w:r>
-      <w:r>
-        <w:rPr>
-          <w:rFonts w:ascii="Times New Roman" w:hAnsi="Times New Roman" w:cs="Times New Roman"/>
-        </w:rPr>
-        <w:t>Submitted</w:t>
-      </w:r>
-      <w:r>
-        <w:rPr>
-          <w:rFonts w:ascii="Times New Roman" w:hAnsi="Times New Roman" w:cs="Times New Roman"/>
-        </w:rPr>
-        <w:t xml:space="preserve"> in Environ. Res.: Food Syst. Manuscript number: ERFS-100194.</w:t>
-      </w:r>
-    </w:p>
-    <w:p>
-      <w:pPr>
-        <w:rPr>
-          <w:rFonts w:ascii="Times New Roman" w:hAnsi="Times New Roman" w:cs="Times New Roman"/>
-        </w:rPr>
-      </w:pPr>
-      <w:r>
-        <w:rPr>
-          <w:rFonts w:ascii="Times New Roman" w:hAnsi="Times New Roman" w:cs="Times New Roman"/>
-          <w:b/>
-          <w:bCs/>
-        </w:rPr>
-        <w:t>2024</w:t>
-      </w:r>
-    </w:p>
-    <w:p>
-      <w:pPr>
-        <w:rPr>
-          <w:rFonts w:ascii="Times New Roman" w:hAnsi="Times New Roman" w:cs="Times New Roman"/>
-          <w:lang w:val="fr-FR"/>
-        </w:rPr>
-      </w:pPr>
-      <w:r>
-        <w:rPr>
-          <w:rFonts w:ascii="Times New Roman" w:hAnsi="Times New Roman" w:cs="Times New Roman"/>
-        </w:rPr>
-        <w:t>Cintrão, R.P., Trivilin, M.I., Jacobi, J., </w:t>
-      </w:r>
-      <w:r>
-        <w:rPr>
-          <w:rFonts w:ascii="Times New Roman" w:hAnsi="Times New Roman" w:cs="Times New Roman"/>
-          <w:b/>
-          <w:bCs/>
-        </w:rPr>
-        <w:t>Malembaka, R.B.</w:t>
-      </w:r>
-      <w:r>
-        <w:rPr>
-          <w:rFonts w:ascii="Times New Roman" w:hAnsi="Times New Roman" w:cs="Times New Roman"/>
-        </w:rPr>
-        <w:t> and Sigrist, M., 2024:</w:t>
-      </w:r>
-      <w:r>
-        <w:rPr>
-          <w:rFonts w:ascii="Times New Roman" w:hAnsi="Times New Roman" w:cs="Times New Roman"/>
-        </w:rPr>
-        <w:br/>
-      </w:r>
-      <w:hyperlink r:id="rId6" w:history="1">
+        <w:proofErr w:type="spellEnd"/>
         <w:r>
           <w:rPr>
             <w:rStyle w:val="Hyperlink"/>
             <w:rFonts w:ascii="Times New Roman" w:hAnsi="Times New Roman" w:cs="Times New Roman"/>
           </w:rPr>
-          <w:t xml:space="preserve">O poder do soja no Paraná e o uso de agrotóxicos: um desafio à agroecologia. </w:t>
+          <w:t xml:space="preserve"> do soja no Paraná e o </w:t>
         </w:r>
+        <w:proofErr w:type="spellStart"/>
         <w:r>
           <w:rPr>
             <w:rStyle w:val="Hyperlink"/>
             <w:rFonts w:ascii="Times New Roman" w:hAnsi="Times New Roman" w:cs="Times New Roman"/>
-            <w:lang w:val="fr-FR"/>
           </w:rPr>
-          <w:t>Cadernos de Agroecologia, </w:t>
+          <w:t>uso</w:t>
+        </w:r>
+        <w:proofErr w:type="spellEnd"/>
+        <w:r>
+          <w:rPr>
+            <w:rStyle w:val="Hyperlink"/>
+            <w:rFonts w:ascii="Times New Roman" w:hAnsi="Times New Roman" w:cs="Times New Roman"/>
+          </w:rPr>
+          <w:t xml:space="preserve"> de </w:t>
+        </w:r>
+        <w:proofErr w:type="spellStart"/>
+        <w:r>
+          <w:rPr>
+            <w:rStyle w:val="Hyperlink"/>
+            <w:rFonts w:ascii="Times New Roman" w:hAnsi="Times New Roman" w:cs="Times New Roman"/>
+          </w:rPr>
+          <w:t>agrotóxicos</w:t>
+        </w:r>
+        <w:proofErr w:type="spellEnd"/>
+        <w:r>
+          <w:rPr>
+            <w:rStyle w:val="Hyperlink"/>
+            <w:rFonts w:ascii="Times New Roman" w:hAnsi="Times New Roman" w:cs="Times New Roman"/>
+          </w:rPr>
+          <w:t xml:space="preserve">: um </w:t>
+        </w:r>
+        <w:proofErr w:type="spellStart"/>
+        <w:r>
+          <w:rPr>
+            <w:rStyle w:val="Hyperlink"/>
+            <w:rFonts w:ascii="Times New Roman" w:hAnsi="Times New Roman" w:cs="Times New Roman"/>
+          </w:rPr>
+          <w:t>desafio</w:t>
+        </w:r>
+        <w:proofErr w:type="spellEnd"/>
+        <w:r>
+          <w:rPr>
+            <w:rStyle w:val="Hyperlink"/>
+            <w:rFonts w:ascii="Times New Roman" w:hAnsi="Times New Roman" w:cs="Times New Roman"/>
+          </w:rPr>
+          <w:t xml:space="preserve"> à </w:t>
+        </w:r>
+        <w:proofErr w:type="spellStart"/>
+        <w:r>
+          <w:rPr>
+            <w:rStyle w:val="Hyperlink"/>
+            <w:rFonts w:ascii="Times New Roman" w:hAnsi="Times New Roman" w:cs="Times New Roman"/>
+          </w:rPr>
+          <w:t>agroecologia</w:t>
+        </w:r>
+        <w:proofErr w:type="spellEnd"/>
+        <w:r>
+          <w:rPr>
+            <w:rStyle w:val="Hyperlink"/>
+            <w:rFonts w:ascii="Times New Roman" w:hAnsi="Times New Roman" w:cs="Times New Roman"/>
+          </w:rPr>
+          <w:t xml:space="preserve">. </w:t>
+        </w:r>
+        <w:proofErr w:type="spellStart"/>
+        <w:r>
+          <w:rPr>
+            <w:rStyle w:val="Hyperlink"/>
+            <w:rFonts w:ascii="Times New Roman" w:hAnsi="Times New Roman" w:cs="Times New Roman"/>
+          </w:rPr>
+          <w:t>Cadernos</w:t>
+        </w:r>
+        <w:proofErr w:type="spellEnd"/>
+        <w:r>
+          <w:rPr>
+            <w:rStyle w:val="Hyperlink"/>
+            <w:rFonts w:ascii="Times New Roman" w:hAnsi="Times New Roman" w:cs="Times New Roman"/>
+          </w:rPr>
+          <w:t xml:space="preserve"> de </w:t>
+        </w:r>
+        <w:proofErr w:type="spellStart"/>
+        <w:r>
+          <w:rPr>
+            <w:rStyle w:val="Hyperlink"/>
+            <w:rFonts w:ascii="Times New Roman" w:hAnsi="Times New Roman" w:cs="Times New Roman"/>
+          </w:rPr>
+          <w:t>Agroecologia</w:t>
+        </w:r>
+        <w:proofErr w:type="spellEnd"/>
+        <w:r>
+          <w:rPr>
+            <w:rStyle w:val="Hyperlink"/>
+            <w:rFonts w:ascii="Times New Roman" w:hAnsi="Times New Roman" w:cs="Times New Roman"/>
+          </w:rPr>
+          <w:t>, </w:t>
         </w:r>
       </w:hyperlink>
       <w:r>
@@ -401,14 +520,12 @@
           <w:rFonts w:ascii="Times New Roman" w:hAnsi="Times New Roman" w:cs="Times New Roman"/>
           <w:b/>
           <w:bCs/>
-          <w:lang w:val="fr-FR"/>
         </w:rPr>
         <w:t>19</w:t>
       </w:r>
       <w:r>
         <w:rPr>
           <w:rFonts w:ascii="Times New Roman" w:hAnsi="Times New Roman" w:cs="Times New Roman"/>
-          <w:lang w:val="fr-FR"/>
         </w:rPr>
         <w:t> (1).</w:t>
       </w:r>
@@ -417,7 +534,6 @@
       <w:pPr>
         <w:rPr>
           <w:rFonts w:ascii="Times New Roman" w:hAnsi="Times New Roman" w:cs="Times New Roman"/>
-          <w:lang w:val="fr-FR"/>
         </w:rPr>
       </w:pPr>
       <w:r>
@@ -425,7 +541,6 @@
           <w:rFonts w:ascii="Times New Roman" w:hAnsi="Times New Roman" w:cs="Times New Roman"/>
           <w:b/>
           <w:bCs/>
-          <w:lang w:val="fr-FR"/>
         </w:rPr>
         <w:t>2023</w:t>
       </w:r>
@@ -436,28 +551,57 @@
           <w:rFonts w:ascii="Times New Roman" w:hAnsi="Times New Roman" w:cs="Times New Roman"/>
         </w:rPr>
       </w:pPr>
-      <w:r>
-        <w:rPr>
-          <w:rFonts w:ascii="Times New Roman" w:hAnsi="Times New Roman" w:cs="Times New Roman"/>
-          <w:lang w:val="fr-FR"/>
-        </w:rPr>
-        <w:t>Tropentag conference 2023: </w:t>
-      </w:r>
-      <w:r>
-        <w:rPr>
-          <w:rFonts w:ascii="Times New Roman" w:hAnsi="Times New Roman" w:cs="Times New Roman"/>
-          <w:b/>
-          <w:bCs/>
-          <w:lang w:val="fr-FR"/>
-        </w:rPr>
-        <w:t>Reussite Malembaka </w:t>
-      </w:r>
-      <w:r>
-        <w:rPr>
-          <w:rFonts w:ascii="Times New Roman" w:hAnsi="Times New Roman" w:cs="Times New Roman"/>
-          <w:lang w:val="fr-FR"/>
-        </w:rPr>
-        <w:t xml:space="preserve">, Braida Thom, Rosangela Cintrão, Marie Sigrist, Stefan Pfister, Johanna Jacobi. </w:t>
+      <w:proofErr w:type="spellStart"/>
+      <w:r>
+        <w:rPr>
+          <w:rFonts w:ascii="Times New Roman" w:hAnsi="Times New Roman" w:cs="Times New Roman"/>
+        </w:rPr>
+        <w:t>Tropentag</w:t>
+      </w:r>
+      <w:proofErr w:type="spellEnd"/>
+      <w:r>
+        <w:rPr>
+          <w:rFonts w:ascii="Times New Roman" w:hAnsi="Times New Roman" w:cs="Times New Roman"/>
+        </w:rPr>
+        <w:t xml:space="preserve"> conference 2023: </w:t>
+      </w:r>
+      <w:proofErr w:type="spellStart"/>
+      <w:r>
+        <w:rPr>
+          <w:rFonts w:ascii="Times New Roman" w:hAnsi="Times New Roman" w:cs="Times New Roman"/>
+          <w:b/>
+          <w:bCs/>
+        </w:rPr>
+        <w:t>Reussite</w:t>
+      </w:r>
+      <w:proofErr w:type="spellEnd"/>
+      <w:r>
+        <w:rPr>
+          <w:rFonts w:ascii="Times New Roman" w:hAnsi="Times New Roman" w:cs="Times New Roman"/>
+          <w:b/>
+          <w:bCs/>
+        </w:rPr>
+        <w:t xml:space="preserve"> Malembaka </w:t>
+      </w:r>
+      <w:r>
+        <w:rPr>
+          <w:rFonts w:ascii="Times New Roman" w:hAnsi="Times New Roman" w:cs="Times New Roman"/>
+        </w:rPr>
+        <w:t xml:space="preserve">, Braida Thom, Rosangela </w:t>
+      </w:r>
+      <w:proofErr w:type="spellStart"/>
+      <w:r>
+        <w:rPr>
+          <w:rFonts w:ascii="Times New Roman" w:hAnsi="Times New Roman" w:cs="Times New Roman"/>
+        </w:rPr>
+        <w:t>Cintrão</w:t>
+      </w:r>
+      <w:proofErr w:type="spellEnd"/>
+      <w:r>
+        <w:rPr>
+          <w:rFonts w:ascii="Times New Roman" w:hAnsi="Times New Roman" w:cs="Times New Roman"/>
+        </w:rPr>
+        <w:t xml:space="preserve">, Marie Sigrist, Stefan Pfister, Johanna Jacobi. </w:t>
       </w:r>
       <w:r>
         <w:rPr>
@@ -471,7 +615,7 @@
         </w:rPr>
         <w:br/>
       </w:r>
-      <w:hyperlink r:id="rId7" w:history="1">
+      <w:hyperlink r:id="rId9" w:history="1">
         <w:r>
           <w:rPr>
             <w:rStyle w:val="Hyperlink"/>
@@ -514,7 +658,35 @@
         <w:rPr>
           <w:rFonts w:ascii="Times New Roman" w:hAnsi="Times New Roman" w:cs="Times New Roman"/>
         </w:rPr>
-        <w:t>, Onwonga, R., Jefwa, J., Ayuke, F. and Nabahungu, L., 2021:</w:t>
+        <w:t xml:space="preserve">, </w:t>
+      </w:r>
+      <w:proofErr w:type="spellStart"/>
+      <w:r>
+        <w:rPr>
+          <w:rFonts w:ascii="Times New Roman" w:hAnsi="Times New Roman" w:cs="Times New Roman"/>
+        </w:rPr>
+        <w:t>Onwonga</w:t>
+      </w:r>
+      <w:proofErr w:type="spellEnd"/>
+      <w:r>
+        <w:rPr>
+          <w:rFonts w:ascii="Times New Roman" w:hAnsi="Times New Roman" w:cs="Times New Roman"/>
+        </w:rPr>
+        <w:t xml:space="preserve">, R., Jefwa, J., Ayuke, F. and </w:t>
+      </w:r>
+      <w:proofErr w:type="spellStart"/>
+      <w:r>
+        <w:rPr>
+          <w:rFonts w:ascii="Times New Roman" w:hAnsi="Times New Roman" w:cs="Times New Roman"/>
+        </w:rPr>
+        <w:t>Nabahungu</w:t>
+      </w:r>
+      <w:proofErr w:type="spellEnd"/>
+      <w:r>
+        <w:rPr>
+          <w:rFonts w:ascii="Times New Roman" w:hAnsi="Times New Roman" w:cs="Times New Roman"/>
+        </w:rPr>
+        <w:t>, L., 2021:</w:t>
       </w:r>
       <w:r>
         <w:rPr>
@@ -522,7 +694,7 @@
         </w:rPr>
         <w:br/>
       </w:r>
-      <w:hyperlink r:id="rId8" w:history="1">
+      <w:hyperlink r:id="rId10" w:history="1">
         <w:r>
           <w:rPr>
             <w:rStyle w:val="Hyperlink"/>
@@ -570,7 +742,35 @@
         <w:rPr>
           <w:rFonts w:ascii="Times New Roman" w:hAnsi="Times New Roman" w:cs="Times New Roman"/>
         </w:rPr>
-        <w:t>, Onwonga, R., Jefwa, J., Ayuke, F. and Nabahungu, L., 2021:</w:t>
+        <w:t xml:space="preserve">, </w:t>
+      </w:r>
+      <w:proofErr w:type="spellStart"/>
+      <w:r>
+        <w:rPr>
+          <w:rFonts w:ascii="Times New Roman" w:hAnsi="Times New Roman" w:cs="Times New Roman"/>
+        </w:rPr>
+        <w:t>Onwonga</w:t>
+      </w:r>
+      <w:proofErr w:type="spellEnd"/>
+      <w:r>
+        <w:rPr>
+          <w:rFonts w:ascii="Times New Roman" w:hAnsi="Times New Roman" w:cs="Times New Roman"/>
+        </w:rPr>
+        <w:t xml:space="preserve">, R., Jefwa, J., Ayuke, F. and </w:t>
+      </w:r>
+      <w:proofErr w:type="spellStart"/>
+      <w:r>
+        <w:rPr>
+          <w:rFonts w:ascii="Times New Roman" w:hAnsi="Times New Roman" w:cs="Times New Roman"/>
+        </w:rPr>
+        <w:t>Nabahungu</w:t>
+      </w:r>
+      <w:proofErr w:type="spellEnd"/>
+      <w:r>
+        <w:rPr>
+          <w:rFonts w:ascii="Times New Roman" w:hAnsi="Times New Roman" w:cs="Times New Roman"/>
+        </w:rPr>
+        <w:t>, L., 2021:</w:t>
       </w:r>
       <w:r>
         <w:rPr>
@@ -578,7 +778,7 @@
         </w:rPr>
         <w:br/>
       </w:r>
-      <w:hyperlink r:id="rId9" w:history="1">
+      <w:hyperlink r:id="rId11" w:history="1">
         <w:r>
           <w:rPr>
             <w:rStyle w:val="Hyperlink"/>
@@ -635,13 +835,23 @@
         </w:rPr>
         <w:t>Bachelor thesis abstract 2016: </w:t>
       </w:r>
-      <w:r>
-        <w:rPr>
-          <w:rFonts w:ascii="Times New Roman" w:hAnsi="Times New Roman" w:cs="Times New Roman"/>
-          <w:b/>
-          <w:bCs/>
-        </w:rPr>
-        <w:t>Reussite Malembaka </w:t>
+      <w:proofErr w:type="spellStart"/>
+      <w:r>
+        <w:rPr>
+          <w:rFonts w:ascii="Times New Roman" w:hAnsi="Times New Roman" w:cs="Times New Roman"/>
+          <w:b/>
+          <w:bCs/>
+        </w:rPr>
+        <w:t>Reussite</w:t>
+      </w:r>
+      <w:proofErr w:type="spellEnd"/>
+      <w:r>
+        <w:rPr>
+          <w:rFonts w:ascii="Times New Roman" w:hAnsi="Times New Roman" w:cs="Times New Roman"/>
+          <w:b/>
+          <w:bCs/>
+        </w:rPr>
+        <w:t xml:space="preserve"> Malembaka </w:t>
       </w:r>
       <w:r>
         <w:rPr>
@@ -655,7 +865,7 @@
         </w:rPr>
         <w:br/>
       </w:r>
-      <w:hyperlink r:id="rId10" w:history="1">
+      <w:hyperlink r:id="rId12" w:history="1">
         <w:r>
           <w:rPr>
             <w:rStyle w:val="Hyperlink"/>
@@ -684,33 +894,37 @@
           <w:rFonts w:ascii="Times New Roman" w:hAnsi="Times New Roman" w:cs="Times New Roman"/>
           <w:b/>
           <w:bCs/>
+        </w:rPr>
+        <w:t>2014</w:t>
+      </w:r>
+      <w:r>
+        <w:rPr>
+          <w:rFonts w:ascii="Times New Roman" w:hAnsi="Times New Roman" w:cs="Times New Roman"/>
+        </w:rPr>
+        <w:br/>
+      </w:r>
+      <w:r>
+        <w:rPr>
+          <w:rFonts w:ascii="Times New Roman" w:hAnsi="Times New Roman" w:cs="Times New Roman"/>
+          <w:b/>
+          <w:bCs/>
+        </w:rPr>
+        <w:t>Malembaka R. B.</w:t>
+      </w:r>
+      <w:r>
+        <w:rPr>
+          <w:rFonts w:ascii="Times New Roman" w:hAnsi="Times New Roman" w:cs="Times New Roman"/>
+        </w:rPr>
+        <w:t xml:space="preserve"> 2014. </w:t>
+      </w:r>
+      <w:r>
+        <w:rPr>
+          <w:rFonts w:ascii="Times New Roman" w:hAnsi="Times New Roman" w:cs="Times New Roman"/>
           <w:lang w:val="fr-FR"/>
         </w:rPr>
-        <w:t>2014</w:t>
-      </w:r>
-      <w:r>
-        <w:rPr>
-          <w:rFonts w:ascii="Times New Roman" w:hAnsi="Times New Roman" w:cs="Times New Roman"/>
-          <w:lang w:val="fr-FR"/>
-        </w:rPr>
-        <w:br/>
-      </w:r>
-      <w:r>
-        <w:rPr>
-          <w:rFonts w:ascii="Times New Roman" w:hAnsi="Times New Roman" w:cs="Times New Roman"/>
-          <w:b/>
-          <w:bCs/>
-          <w:lang w:val="fr-FR"/>
-        </w:rPr>
-        <w:t>Malembaka R. B.</w:t>
-      </w:r>
-      <w:r>
-        <w:rPr>
-          <w:rFonts w:ascii="Times New Roman" w:hAnsi="Times New Roman" w:cs="Times New Roman"/>
-          <w:lang w:val="fr-FR"/>
-        </w:rPr>
-        <w:t> 2014. Effet de la fertilisation organique, minérale et phosphorée sur le rendement du niébé (</w:t>
-      </w:r>
+        <w:t>Effet de la fertilisation organique, minérale et phosphorée sur le rendement du niébé (</w:t>
+      </w:r>
+      <w:proofErr w:type="spellStart"/>
       <w:r>
         <w:rPr>
           <w:rFonts w:ascii="Times New Roman" w:hAnsi="Times New Roman" w:cs="Times New Roman"/>
@@ -718,21 +932,99 @@
           <w:iCs/>
           <w:lang w:val="fr-FR"/>
         </w:rPr>
-        <w:t>Vigna unguiculata</w:t>
-      </w:r>
-      <w:r>
-        <w:rPr>
-          <w:rFonts w:ascii="Times New Roman" w:hAnsi="Times New Roman" w:cs="Times New Roman"/>
+        <w:t>Vigna</w:t>
+      </w:r>
+      <w:proofErr w:type="spellEnd"/>
+      <w:r>
+        <w:rPr>
+          <w:rFonts w:ascii="Times New Roman" w:hAnsi="Times New Roman" w:cs="Times New Roman"/>
+          <w:i/>
+          <w:iCs/>
           <w:lang w:val="fr-FR"/>
         </w:rPr>
-        <w:t xml:space="preserve"> L.) dans les conditions édapho-climatiques de Karhale. </w:t>
-      </w:r>
+        <w:t xml:space="preserve"> </w:t>
+      </w:r>
+      <w:proofErr w:type="spellStart"/>
+      <w:r>
+        <w:rPr>
+          <w:rFonts w:ascii="Times New Roman" w:hAnsi="Times New Roman" w:cs="Times New Roman"/>
+          <w:i/>
+          <w:iCs/>
+          <w:lang w:val="fr-FR"/>
+        </w:rPr>
+        <w:t>unguiculata</w:t>
+      </w:r>
+      <w:proofErr w:type="spellEnd"/>
+      <w:r>
+        <w:rPr>
+          <w:rFonts w:ascii="Times New Roman" w:hAnsi="Times New Roman" w:cs="Times New Roman"/>
+          <w:lang w:val="fr-FR"/>
+        </w:rPr>
+        <w:t xml:space="preserve"> L.) dans les conditions </w:t>
+      </w:r>
+      <w:proofErr w:type="spellStart"/>
+      <w:r>
+        <w:rPr>
+          <w:rFonts w:ascii="Times New Roman" w:hAnsi="Times New Roman" w:cs="Times New Roman"/>
+          <w:lang w:val="fr-FR"/>
+        </w:rPr>
+        <w:t>édapho</w:t>
+      </w:r>
+      <w:proofErr w:type="spellEnd"/>
+      <w:r>
+        <w:rPr>
+          <w:rFonts w:ascii="Times New Roman" w:hAnsi="Times New Roman" w:cs="Times New Roman"/>
+          <w:lang w:val="fr-FR"/>
+        </w:rPr>
+        <w:t xml:space="preserve">-climatiques de </w:t>
+      </w:r>
+      <w:proofErr w:type="spellStart"/>
+      <w:r>
+        <w:rPr>
+          <w:rFonts w:ascii="Times New Roman" w:hAnsi="Times New Roman" w:cs="Times New Roman"/>
+          <w:lang w:val="fr-FR"/>
+        </w:rPr>
+        <w:t>Karhale</w:t>
+      </w:r>
+      <w:proofErr w:type="spellEnd"/>
+      <w:r>
+        <w:rPr>
+          <w:rFonts w:ascii="Times New Roman" w:hAnsi="Times New Roman" w:cs="Times New Roman"/>
+          <w:lang w:val="fr-FR"/>
+        </w:rPr>
+        <w:t xml:space="preserve">. </w:t>
+      </w:r>
+      <w:proofErr w:type="spellStart"/>
       <w:r>
         <w:rPr>
           <w:rFonts w:ascii="Times New Roman" w:hAnsi="Times New Roman" w:cs="Times New Roman"/>
           <w:lang w:val="de-CH"/>
         </w:rPr>
-        <w:t>Travail de Fin de Cycle. Inédit. UCB. </w:t>
+        <w:t>Travail</w:t>
+      </w:r>
+      <w:proofErr w:type="spellEnd"/>
+      <w:r>
+        <w:rPr>
+          <w:rFonts w:ascii="Times New Roman" w:hAnsi="Times New Roman" w:cs="Times New Roman"/>
+          <w:lang w:val="de-CH"/>
+        </w:rPr>
+        <w:t xml:space="preserve"> de Fin de Cycle. </w:t>
+      </w:r>
+      <w:proofErr w:type="spellStart"/>
+      <w:r>
+        <w:rPr>
+          <w:rFonts w:ascii="Times New Roman" w:hAnsi="Times New Roman" w:cs="Times New Roman"/>
+          <w:lang w:val="de-CH"/>
+        </w:rPr>
+        <w:t>Inédit</w:t>
+      </w:r>
+      <w:proofErr w:type="spellEnd"/>
+      <w:r>
+        <w:rPr>
+          <w:rFonts w:ascii="Times New Roman" w:hAnsi="Times New Roman" w:cs="Times New Roman"/>
+          <w:lang w:val="de-CH"/>
+        </w:rPr>
+        <w:t>. UCB. </w:t>
       </w:r>
       <w:r>
         <w:rPr>
@@ -759,6 +1051,65 @@
     </w:sectPr>
   </w:body>
 </w:document>
+</file>
+
+<file path=word/numbering.xml><?xml version="1.0" encoding="utf-8"?>
+<w:numbering xmlns:wpc="http://schemas.microsoft.com/office/word/2010/wordprocessingCanvas" xmlns:cx="http://schemas.microsoft.com/office/drawing/2014/chartex" xmlns:cx1="http://schemas.microsoft.com/office/drawing/2015/9/8/chartex" xmlns:cx2="http://schemas.microsoft.com/office/drawing/2015/10/21/chartex" xmlns:cx3="http://schemas.microsoft.com/office/drawing/2016/5/9/chartex" xmlns:cx4="http://schemas.microsoft.com/office/drawing/2016/5/10/chartex" xmlns:cx5="http://schemas.microsoft.com/office/drawing/2016/5/11/chartex" xmlns:cx6="http://schemas.microsoft.com/office/drawing/2016/5/12/chartex" xmlns:cx7="http://schemas.microsoft.com/office/drawing/2016/5/13/chartex" xmlns:cx8="http://schemas.microsoft.com/office/drawing/2016/5/14/chartex" xmlns:mc="http://schemas.openxmlformats.org/markup-compatibility/2006" xmlns:aink="http://schemas.microsoft.com/office/drawing/2016/ink" xmlns:am3d="http://schemas.microsoft.com/office/drawing/2017/model3d" xmlns:o="urn:schemas-microsoft-com:office:office" xmlns:oel="http://schemas.microsoft.com/office/2019/extlst" xmlns:r="http://schemas.openxmlformats.org/officeDocument/2006/relationships" xmlns:m="http://schemas.openxmlformats.org/officeDocument/2006/math" xmlns:v="urn:schemas-microsoft-com:vml" xmlns:wp14="http://schemas.microsoft.com/office/word/2010/wordprocessingDrawing" xmlns:wp="http://schemas.openxmlformats.org/drawingml/2006/wordprocessingDrawing" xmlns:w10="urn:schemas-microsoft-com:office:word" xmlns:w="http://schemas.openxmlformats.org/wordprocessingml/2006/main" xmlns:w14="http://schemas.microsoft.com/office/word/2010/wordml" xmlns:w15="http://schemas.microsoft.com/office/word/2012/wordml" xmlns:w16cex="http://schemas.microsoft.com/office/word/2018/wordml/cex" xmlns:w16cid="http://schemas.microsoft.com/office/word/2016/wordml/cid" xmlns:w16="http://schemas.microsoft.com/office/word/2018/wordml" xmlns:w16du="http://schemas.microsoft.com/office/word/2023/wordml/word16du" xmlns:w16sdtdh="http://schemas.microsoft.com/office/word/2020/wordml/sdtdatahash" xmlns:w16sdtfl="http://schemas.microsoft.com/office/word/2024/wordml/sdtformatlock" xmlns:w16se="http://schemas.microsoft.com/office/word/2015/wordml/symex" xmlns:wpg="http://schemas.microsoft.com/office/word/2010/wordprocessingGroup" xmlns:wpi="http://schemas.microsoft.com/office/word/2010/wordprocessingInk" xmlns:wne="http://schemas.microsoft.com/office/word/2006/wordml" xmlns:wps="http://schemas.microsoft.com/office/word/2010/wordprocessingShape" mc:Ignorable="w14 w15 w16se w16cid w16 w16cex w16sdtdh w16sdtfl w16du wp14">
+  <w:abstractNum w:abstractNumId="0" w15:restartNumberingAfterBreak="0">
+    <w:nsid w:val="A056BFFE"/>
+    <w:multiLevelType w:val="hybridMultilevel"/>
+    <w:tmpl w:val="FFFFFFFF"/>
+    <w:lvl w:ilvl="0" w:tplc="FFFFFFFF">
+      <w:start w:val="1"/>
+      <w:numFmt w:val="bullet"/>
+      <w:lvlText w:val="•"/>
+      <w:lvlJc w:val="left"/>
+    </w:lvl>
+    <w:lvl w:ilvl="1" w:tplc="FFFFFFFF">
+      <w:numFmt w:val="decimal"/>
+      <w:lvlText w:val=""/>
+      <w:lvlJc w:val="left"/>
+    </w:lvl>
+    <w:lvl w:ilvl="2" w:tplc="FFFFFFFF">
+      <w:numFmt w:val="decimal"/>
+      <w:lvlText w:val=""/>
+      <w:lvlJc w:val="left"/>
+    </w:lvl>
+    <w:lvl w:ilvl="3" w:tplc="FFFFFFFF">
+      <w:numFmt w:val="decimal"/>
+      <w:lvlText w:val=""/>
+      <w:lvlJc w:val="left"/>
+    </w:lvl>
+    <w:lvl w:ilvl="4" w:tplc="FFFFFFFF">
+      <w:numFmt w:val="decimal"/>
+      <w:lvlText w:val=""/>
+      <w:lvlJc w:val="left"/>
+    </w:lvl>
+    <w:lvl w:ilvl="5" w:tplc="FFFFFFFF">
+      <w:numFmt w:val="decimal"/>
+      <w:lvlText w:val=""/>
+      <w:lvlJc w:val="left"/>
+    </w:lvl>
+    <w:lvl w:ilvl="6" w:tplc="FFFFFFFF">
+      <w:numFmt w:val="decimal"/>
+      <w:lvlText w:val=""/>
+      <w:lvlJc w:val="left"/>
+    </w:lvl>
+    <w:lvl w:ilvl="7" w:tplc="FFFFFFFF">
+      <w:numFmt w:val="decimal"/>
+      <w:lvlText w:val=""/>
+      <w:lvlJc w:val="left"/>
+    </w:lvl>
+    <w:lvl w:ilvl="8" w:tplc="FFFFFFFF">
+      <w:numFmt w:val="decimal"/>
+      <w:lvlText w:val=""/>
+      <w:lvlJc w:val="left"/>
+    </w:lvl>
+  </w:abstractNum>
+  <w:num w:numId="1" w16cid:durableId="2131047035">
+    <w:abstractNumId w:val="0"/>
+  </w:num>
+</w:numbering>
 </file>
 
 <file path=word/styles.xml><?xml version="1.0" encoding="utf-8"?>

</xml_diff>